<commit_message>
Fill power of attorney No. 1 dated 16.02.2024 (5-year term) in all documents
Co-Authored-By: Claude Opus 5.5 <noreply@anthropic.com>
Claude-Session: https://claude.ai/code/session_018ZBy6xfQB1sHcr5htdU16V
</commit_message>
<xml_diff>
--- a/Доверенность_Тимшин.docx
+++ b/Доверенность_Тимшин.docx
@@ -7,13 +7,13 @@
         <w:pStyle w:val="Title"/>
       </w:pPr>
     </w:p>
-    <w:bookmarkStart w:id="20" w:name="доверенность-номер"/>
+    <w:bookmarkStart w:id="20" w:name="доверенность-1"/>
     <w:p>
       <w:pPr>
         <w:pStyle w:val="Heading1"/>
       </w:pPr>
       <w:r>
-        <w:t xml:space="preserve">ДОВЕРЕННОСТЬ № [номер]</w:t>
+        <w:t xml:space="preserve">ДОВЕРЕННОСТЬ № 1</w:t>
       </w:r>
     </w:p>
     <w:p>
@@ -21,7 +21,7 @@
         <w:pStyle w:val="FirstParagraph"/>
       </w:pPr>
       <w:r>
-        <w:t xml:space="preserve">г. [город], [дата прописью]</w:t>
+        <w:t xml:space="preserve">г. [город], шестнадцатое февраля две тысячи двадцать четвёртого года</w:t>
       </w:r>
     </w:p>
     <w:p>
@@ -85,7 +85,7 @@
         <w:pStyle w:val="FirstParagraph"/>
       </w:pPr>
       <w:r>
-        <w:t xml:space="preserve">Доверенность выдана сроком на [1 (один) год] без права передоверия.</w:t>
+        <w:t xml:space="preserve">Доверенность выдана сроком на 5 (пять) лет без права передоверия.</w:t>
       </w:r>
     </w:p>
     <w:p>

</xml_diff>